<commit_message>
fix(contract): in A4 dung margin, du trang - @page margin 0, modal ve static, mau mock doi sang A4
</commit_message>
<xml_diff>
--- a/docs/mau-hop-dong-mock/HD_DICH_THUAT_MOCK.docx
+++ b/docs/mau-hop-dong-mock/HD_DICH_THUAT_MOCK.docx
@@ -840,13 +840,13 @@
         <w:tblLook w:firstColumn="1" w:firstRow="1" w:lastColumn="0" w:lastRow="0" w:noHBand="0" w:noVBand="1" w:val="04A0"/>
       </w:tblPr>
       <w:tblGrid>
-        <w:gridCol w:w="4320"/>
-        <w:gridCol w:w="4320"/>
+        <w:gridCol w:w="4153"/>
+        <w:gridCol w:w="4153"/>
       </w:tblGrid>
       <w:tr>
         <w:tc>
           <w:tcPr>
-            <w:tcW w:type="dxa" w:w="4320"/>
+            <w:tcW w:type="dxa" w:w="4153"/>
           </w:tcPr>
           <w:p>
             <w:pPr>
@@ -864,7 +864,7 @@
         </w:tc>
         <w:tc>
           <w:tcPr>
-            <w:tcW w:type="dxa" w:w="4320"/>
+            <w:tcW w:type="dxa" w:w="4153"/>
           </w:tcPr>
           <w:p>
             <w:pPr>
@@ -884,7 +884,7 @@
       <w:tr>
         <w:tc>
           <w:tcPr>
-            <w:tcW w:type="dxa" w:w="4320"/>
+            <w:tcW w:type="dxa" w:w="4153"/>
           </w:tcPr>
           <w:p>
             <w:pPr>
@@ -902,7 +902,7 @@
         </w:tc>
         <w:tc>
           <w:tcPr>
-            <w:tcW w:type="dxa" w:w="4320"/>
+            <w:tcW w:type="dxa" w:w="4153"/>
           </w:tcPr>
           <w:p>
             <w:pPr>
@@ -922,7 +922,7 @@
       <w:tr>
         <w:tc>
           <w:tcPr>
-            <w:tcW w:type="dxa" w:w="4320"/>
+            <w:tcW w:type="dxa" w:w="4153"/>
           </w:tcPr>
           <w:p>
             <w:r/>
@@ -930,7 +930,7 @@
         </w:tc>
         <w:tc>
           <w:tcPr>
-            <w:tcW w:type="dxa" w:w="4320"/>
+            <w:tcW w:type="dxa" w:w="4153"/>
           </w:tcPr>
           <w:p>
             <w:r/>
@@ -940,7 +940,7 @@
       <w:tr>
         <w:tc>
           <w:tcPr>
-            <w:tcW w:type="dxa" w:w="4320"/>
+            <w:tcW w:type="dxa" w:w="4153"/>
           </w:tcPr>
           <w:p>
             <w:r/>
@@ -948,7 +948,7 @@
         </w:tc>
         <w:tc>
           <w:tcPr>
-            <w:tcW w:type="dxa" w:w="4320"/>
+            <w:tcW w:type="dxa" w:w="4153"/>
           </w:tcPr>
           <w:p>
             <w:r/>
@@ -958,7 +958,7 @@
       <w:tr>
         <w:tc>
           <w:tcPr>
-            <w:tcW w:type="dxa" w:w="4320"/>
+            <w:tcW w:type="dxa" w:w="4153"/>
           </w:tcPr>
           <w:p>
             <w:r/>
@@ -966,7 +966,7 @@
         </w:tc>
         <w:tc>
           <w:tcPr>
-            <w:tcW w:type="dxa" w:w="4320"/>
+            <w:tcW w:type="dxa" w:w="4153"/>
           </w:tcPr>
           <w:p>
             <w:r/>
@@ -976,7 +976,7 @@
       <w:tr>
         <w:tc>
           <w:tcPr>
-            <w:tcW w:type="dxa" w:w="4320"/>
+            <w:tcW w:type="dxa" w:w="4153"/>
           </w:tcPr>
           <w:p>
             <w:r/>
@@ -984,7 +984,7 @@
         </w:tc>
         <w:tc>
           <w:tcPr>
-            <w:tcW w:type="dxa" w:w="4320"/>
+            <w:tcW w:type="dxa" w:w="4153"/>
           </w:tcPr>
           <w:p>
             <w:r/>
@@ -994,7 +994,7 @@
       <w:tr>
         <w:tc>
           <w:tcPr>
-            <w:tcW w:type="dxa" w:w="4320"/>
+            <w:tcW w:type="dxa" w:w="4153"/>
           </w:tcPr>
           <w:p>
             <w:pPr>
@@ -1012,7 +1012,7 @@
         </w:tc>
         <w:tc>
           <w:tcPr>
-            <w:tcW w:type="dxa" w:w="4320"/>
+            <w:tcW w:type="dxa" w:w="4153"/>
           </w:tcPr>
           <w:p>
             <w:pPr>
@@ -1031,7 +1031,7 @@
       </w:tr>
     </w:tbl>
     <w:sectPr>
-      <w:pgSz w:w="12240" w:h="15840"/>
+      <w:pgSz w:w="11906" w:h="16838"/>
       <w:pgMar w:top="1440" w:right="1800" w:bottom="1440" w:left="1800" w:header="720" w:footer="720" w:gutter="0"/>
       <w:cols w:space="720"/>
       <w:docGrid w:linePitch="360"/>

</xml_diff>